<commit_message>
refactor: remove word docx and mathtype export, standardize on pure vector pdf
</commit_message>
<xml_diff>
--- a/De_Xuat_De_Tai_Quesy.docx
+++ b/De_Xuat_De_Tai_Quesy.docx
@@ -288,7 +288,7 @@
         <w:t xml:space="preserve">• Mô tả ngắn gọn: </w:t>
       </w:r>
       <w:r>
-        <w:t>Quesy là nền tảng phần mềm Web App chuyên sâu hỗ trợ giáo viên và các hội đồng khảo thí số hóa đề thi tự động từ tài liệu thô (Word, PDF scan, Ảnh chụp), giải mã công thức MathType sang LaTeX, quản lý ngân hàng câu hỏi chuẩn hóa theo Thông tư 32/2018/TT-BGDĐT, thiết lập ma trận rút đề và xáo trộn mã đề an toàn theo định dạng đề thi mới từ năm 2025 (Quyết định 764/QĐ-BGDĐT), đồng thời cung cấp môi trường soạn đề LaTeX 6:4 có trợ lý AI hỗ trợ sửa đúng dòng và xuất bản đề thi Microsoft Word (.docx) nhúng MathType 7.0 OLE Vector in ấn chuẩn mực.</w:t>
+        <w:t>Quesy là nền tảng phần mềm Web App chuyên sâu hỗ trợ giáo viên và các hội đồng khảo thí số hóa đề thi tự động từ tài liệu thô (PDF scan, Ảnh chụp, Word), giải mã công thức toán sang LaTeX, quản lý ngân hàng câu hỏi chuẩn hóa theo Thông tư 32/2018/TT-BGDĐT, thiết lập ma trận rút đề và xáo trộn mã đề an toàn theo định dạng đề thi mới từ năm 2025 (Quyết định 764/QĐ-BGDĐT), đồng thời cung cấp môi trường soạn đề LaTeX 6:4 có trợ lý AI hỗ trợ sửa đúng dòng và xuất bản đề thi chuẩn in ấn dạng vector PDF chất lượng cao.</w:t>
       </w:r>
     </w:p>
     <w:p>
@@ -518,7 +518,7 @@
         <w:rPr>
           <w:sz w:val="21"/>
         </w:rPr>
-        <w:t>Xuất file Word (.docx) chuẩn khổ giấy A4 Portrait, font Times New Roman 11pt, công thức nhúng MathType 7.0 OLE Vector WMF (cho phép giáo viên click đúp mở MathType 7 sửa 2 chiều bình thường), OMML native (&lt;m:oMath&gt;), tự động chuyển bảng thống kê LaTeX thành native Word table, xuất PDF in ấn, đóng gói ZIP trọn bộ kèm phiếu soi OMR.</w:t>
+        <w:t>Xuất bản tài liệu đề thi và hướng dẫn giải dưới định dạng PDF vector độ phân giải cao chuẩn khổ giấy A4 Portrait, font Times New Roman / CMU Serif sắc nét, phiếu trả lời trắc nghiệm chuẩn máy chấm OMR và đóng gói trọn bộ tệp ZIP.</w:t>
       </w:r>
     </w:p>
     <w:p>
@@ -685,13 +685,13 @@
           <w:b/>
           <w:sz w:val="21"/>
         </w:rPr>
-        <w:t xml:space="preserve">Công nghệ MathType 7.0 OLE Vector WMF thuần Python: </w:t>
+        <w:t xml:space="preserve">Động cơ Xuất bản PDF Vector Siêu tốc &amp; Tự động Dàn trang: </w:t>
       </w:r>
       <w:r>
         <w:rPr>
           <w:sz w:val="21"/>
         </w:rPr>
-        <w:t>Giải pháp nhúng OLE nhị phân CFB MTEF v5 và vector WMF chuẩn APM 1440 DPI trực tiếp bằng Python, hỗ trợ mở MathType 7 sửa 2 chiều, khắc phục triệt để lỗi ảnh raster PNG mờ nét trên Word.</w:t>
+        <w:t>Xuất bản trực tiếp tệp PDF in ấn chuẩn quốc tế từ LaTeX và HTML5/ReportLab (&lt; 100ms) với font Unicode tiếng Việt đầy đủ, loại bỏ phụ thuộc vào các phần mềm thương mại độc quyền.</w:t>
       </w:r>
     </w:p>
     <w:p>

</xml_diff>